<commit_message>
Quick Update 2026-04-13 21:50
</commit_message>
<xml_diff>
--- a/data/jobs/00051_d7c3a912/generated/resume.docx
+++ b/data/jobs/00051_d7c3a912/generated/resume.docx
@@ -145,7 +145,7 @@
           <w:rFonts w:ascii="Arial" w:hAnsi="Arial"/>
           <w:sz w:val="22"/>
         </w:rPr>
-        <w:t>Built and maintained API connectors ingesting P95 telemetry from 6,000+ enterprise endpoints (BMC TrueSight, TSCO, AppDynamics APIs) into Oracle and AWS data stores â€” automated, self-healing, and fully documented.</w:t>
+        <w:t>Built and maintained API connectors ingesting P95 telemetry from 6,000+ enterprise endpoints (BMC TrueSight, TSCO, AppDynamics APIs) into Oracle and AWS data stores — automated, self-healing, and fully documented.</w:t>
       </w:r>
     </w:p>
     <w:p>
@@ -169,7 +169,7 @@
           <w:rFonts w:ascii="Arial" w:hAnsi="Arial"/>
           <w:sz w:val="22"/>
         </w:rPr>
-        <w:t>Built hybrid AWS lakehouse platform: S3 landing zone for raw telemetry ingestion, AWS Glue for ETL transformation, Redshift for analytics and forecasting â€” with Parquet/Snappy columnar storage and Athena query optimization.</w:t>
+        <w:t>Built hybrid AWS lakehouse platform: S3 landing zone for raw telemetry ingestion, AWS Glue for ETL transformation, Redshift for analytics and forecasting — with Parquet/Snappy columnar storage and Athena query optimization.</w:t>
       </w:r>
     </w:p>
     <w:p>
@@ -299,7 +299,7 @@
           <w:rFonts w:ascii="Arial" w:hAnsi="Arial"/>
           <w:sz w:val="22"/>
         </w:rPr>
-        <w:t>Led large-scale CA APM implementations and upgrades (9.1 to 10.1), managing 4,000â€“6,000 monitoring agents for enterprise financial clients.</w:t>
+        <w:t>Led large-scale CA APM implementations and upgrades (9.1 to 10.1), managing 4,000–6,000 monitoring agents for enterprise financial clients.</w:t>
       </w:r>
     </w:p>
     <w:p>
@@ -608,7 +608,7 @@
           <w:b/>
           <w:sz w:val="22"/>
         </w:rPr>
-        <w:t>HorizonScale â€” AI Capacity Forecasting Engine</w:t>
+        <w:t>HorizonScale — AI Capacity Forecasting Engine</w:t>
       </w:r>
       <w:r>
         <w:rPr>

</xml_diff>